<commit_message>
fix(paper): remove dangling caveats reference on the references page
The references intro said 'Two caveats carried forward, below the list' but
those caveats were (correctly) stripped from the public submission version,
leaving a dangling reference. Replaced with a self-contained note on the 2W3A
PDB citation. Caught in a full-PDF proofread. PDF rebuilt.

Co-Authored-By: Claude Opus 4.8 <noreply@anthropic.com>
</commit_message>
<xml_diff>
--- a/out/paper_A.docx
+++ b/out/paper_A.docx
@@ -3924,29 +3924,7 @@
           <w:i/>
           <w:iCs/>
         </w:rPr>
-        <w:t xml:space="preserve">All entries verified against NCBI E-utilities, CrossRef, or the RCSB PDB Data API (2026-07-23/24); see</w:t>
-      </w:r>
-      <w:r>
-        <w:rPr>
-          <w:i/>
-          <w:iCs/>
-        </w:rPr>
-        <w:t xml:space="preserve"> </w:t>
-      </w:r>
-      <w:r>
-        <w:rPr>
-          <w:rStyle w:val="VerbatimChar"/>
-          <w:i/>
-          <w:iCs/>
-        </w:rPr>
-        <w:t xml:space="preserve">logs/refs_*.json</w:t>
-      </w:r>
-      <w:r>
-        <w:rPr>
-          <w:i/>
-          <w:iCs/>
-        </w:rPr>
-        <w:t xml:space="preserve">. Two caveats carried forward, below the list.</w:t>
+        <w:t xml:space="preserve">All entries verified against NCBI E-utilities, CrossRef, or the RCSB PDB Data API. PDB structures are cited by accession; note that RCSB lists no valid primary-citation record for 2W3A, which is therefore referenced by PDB ID only.</w:t>
       </w:r>
     </w:p>
     <w:p>

</xml_diff>